<commit_message>
catégorie vue create et delete
</commit_message>
<xml_diff>
--- a/TP2_énoncé_A26.docx
+++ b/TP2_énoncé_A26.docx
@@ -277,25 +277,7 @@
           <w:b/>
           <w:bCs/>
         </w:rPr>
-        <w:t xml:space="preserve">les migrations et les </w:t>
-      </w:r>
-      <w:proofErr w:type="spellStart"/>
-      <w:r>
-        <w:rPr>
-          <w:rFonts w:ascii="Gill Sans MT" w:hAnsi="Gill Sans MT"/>
-          <w:b/>
-          <w:bCs/>
-        </w:rPr>
-        <w:t>commits</w:t>
-      </w:r>
-      <w:proofErr w:type="spellEnd"/>
-      <w:r>
-        <w:rPr>
-          <w:rFonts w:ascii="Gill Sans MT" w:hAnsi="Gill Sans MT"/>
-          <w:b/>
-          <w:bCs/>
-        </w:rPr>
-        <w:t xml:space="preserve"> demandés</w:t>
+        <w:t>les migrations et les commits demandés</w:t>
       </w:r>
       <w:r>
         <w:rPr>
@@ -404,7 +386,6 @@
         </w:rPr>
         <w:t>Créez un nouveau projet MVC qui se nomme </w:t>
       </w:r>
-      <w:proofErr w:type="spellStart"/>
       <w:r>
         <w:rPr>
           <w:rFonts w:ascii="Gill Sans MT" w:hAnsi="Gill Sans MT"/>
@@ -413,7 +394,6 @@
         </w:rPr>
         <w:t>NutriVie</w:t>
       </w:r>
-      <w:proofErr w:type="spellEnd"/>
     </w:p>
     <w:p>
       <w:pPr>
@@ -427,19 +407,11 @@
           <w:rFonts w:ascii="Gill Sans MT" w:hAnsi="Gill Sans MT"/>
         </w:rPr>
       </w:pPr>
-      <w:proofErr w:type="gramStart"/>
       <w:r>
         <w:rPr>
           <w:rFonts w:ascii="Gill Sans MT" w:hAnsi="Gill Sans MT"/>
         </w:rPr>
-        <w:t>Installez les</w:t>
-      </w:r>
-      <w:proofErr w:type="gramEnd"/>
-      <w:r>
-        <w:rPr>
-          <w:rFonts w:ascii="Gill Sans MT" w:hAnsi="Gill Sans MT"/>
-        </w:rPr>
-        <w:t xml:space="preserve"> packages suivants :</w:t>
+        <w:t>Installez les packages suivants :</w:t>
       </w:r>
     </w:p>
     <w:p>
@@ -454,19 +426,11 @@
           <w:rFonts w:ascii="Gill Sans MT" w:hAnsi="Gill Sans MT"/>
         </w:rPr>
       </w:pPr>
-      <w:proofErr w:type="spellStart"/>
       <w:r>
         <w:rPr>
           <w:rFonts w:ascii="Gill Sans MT" w:hAnsi="Gill Sans MT"/>
         </w:rPr>
-        <w:t>Microsoft.EntityFrameworkCore</w:t>
-      </w:r>
-      <w:proofErr w:type="spellEnd"/>
-      <w:r>
-        <w:rPr>
-          <w:rFonts w:ascii="Gill Sans MT" w:hAnsi="Gill Sans MT"/>
-        </w:rPr>
-        <w:t> </w:t>
+        <w:t>Microsoft.EntityFrameworkCore </w:t>
       </w:r>
       <w:r>
         <w:rPr>
@@ -505,21 +469,11 @@
           <w:rFonts w:ascii="Gill Sans MT" w:hAnsi="Gill Sans MT"/>
         </w:rPr>
       </w:pPr>
-      <w:proofErr w:type="spellStart"/>
-      <w:proofErr w:type="gramStart"/>
       <w:r>
         <w:rPr>
           <w:rFonts w:ascii="Gill Sans MT" w:hAnsi="Gill Sans MT"/>
         </w:rPr>
-        <w:t>Microsoft.EntityFrameworkCore.Design</w:t>
-      </w:r>
-      <w:proofErr w:type="spellEnd"/>
-      <w:proofErr w:type="gramEnd"/>
-      <w:r>
-        <w:rPr>
-          <w:rFonts w:ascii="Gill Sans MT" w:hAnsi="Gill Sans MT"/>
-        </w:rPr>
-        <w:t> </w:t>
+        <w:t>Microsoft.EntityFrameworkCore.Design </w:t>
       </w:r>
       <w:r>
         <w:rPr>
@@ -558,21 +512,11 @@
           <w:rFonts w:ascii="Gill Sans MT" w:hAnsi="Gill Sans MT"/>
         </w:rPr>
       </w:pPr>
-      <w:proofErr w:type="spellStart"/>
-      <w:proofErr w:type="gramStart"/>
       <w:r>
         <w:rPr>
           <w:rFonts w:ascii="Gill Sans MT" w:hAnsi="Gill Sans MT"/>
         </w:rPr>
-        <w:t>Microsoft.EntityFrameworkCore.SqlServer</w:t>
-      </w:r>
-      <w:proofErr w:type="spellEnd"/>
-      <w:proofErr w:type="gramEnd"/>
-      <w:r>
-        <w:rPr>
-          <w:rFonts w:ascii="Gill Sans MT" w:hAnsi="Gill Sans MT"/>
-        </w:rPr>
-        <w:t> </w:t>
+        <w:t>Microsoft.EntityFrameworkCore.SqlServer </w:t>
       </w:r>
       <w:r>
         <w:rPr>
@@ -611,21 +555,11 @@
           <w:rFonts w:ascii="Gill Sans MT" w:hAnsi="Gill Sans MT"/>
         </w:rPr>
       </w:pPr>
-      <w:proofErr w:type="spellStart"/>
-      <w:proofErr w:type="gramStart"/>
       <w:r>
         <w:rPr>
           <w:rFonts w:ascii="Gill Sans MT" w:hAnsi="Gill Sans MT"/>
         </w:rPr>
-        <w:t>Microsoft.EntityFrameworkCore.tools</w:t>
-      </w:r>
-      <w:proofErr w:type="spellEnd"/>
-      <w:proofErr w:type="gramEnd"/>
-      <w:r>
-        <w:rPr>
-          <w:rFonts w:ascii="Gill Sans MT" w:hAnsi="Gill Sans MT"/>
-        </w:rPr>
-        <w:t> </w:t>
+        <w:t>Microsoft.EntityFrameworkCore.tools </w:t>
       </w:r>
       <w:r>
         <w:rPr>
@@ -665,30 +599,12 @@
           <w:lang w:val="en-CA"/>
         </w:rPr>
       </w:pPr>
-      <w:proofErr w:type="spellStart"/>
-      <w:proofErr w:type="gramStart"/>
       <w:r>
         <w:rPr>
           <w:rFonts w:ascii="Gill Sans MT" w:hAnsi="Gill Sans MT"/>
           <w:lang w:val="en-CA"/>
         </w:rPr>
-        <w:t>Microsoft.VisualStudio.Web.CodeGeneration</w:t>
-      </w:r>
-      <w:proofErr w:type="gramEnd"/>
-      <w:r>
-        <w:rPr>
-          <w:rFonts w:ascii="Gill Sans MT" w:hAnsi="Gill Sans MT"/>
-          <w:lang w:val="en-CA"/>
-        </w:rPr>
-        <w:t>.Design</w:t>
-      </w:r>
-      <w:proofErr w:type="spellEnd"/>
-      <w:r>
-        <w:rPr>
-          <w:rFonts w:ascii="Gill Sans MT" w:hAnsi="Gill Sans MT"/>
-          <w:lang w:val="en-CA"/>
-        </w:rPr>
-        <w:t> </w:t>
+        <w:t>Microsoft.VisualStudio.Web.CodeGeneration.Design </w:t>
       </w:r>
       <w:r>
         <w:rPr>
@@ -893,7 +809,6 @@
         </w:rPr>
         <w:t xml:space="preserve"> </w:t>
       </w:r>
-      <w:proofErr w:type="spellStart"/>
       <w:r>
         <w:rPr>
           <w:rFonts w:ascii="Gill Sans MT" w:hAnsi="Gill Sans MT"/>
@@ -902,7 +817,6 @@
         </w:rPr>
         <w:t>Layout</w:t>
       </w:r>
-      <w:proofErr w:type="spellEnd"/>
       <w:r>
         <w:rPr>
           <w:rFonts w:ascii="Gill Sans MT" w:hAnsi="Gill Sans MT"/>
@@ -931,54 +845,8 @@
           <w:b/>
           <w:bCs/>
         </w:rPr>
-        <w:t>/</w:t>
-      </w:r>
-      <w:proofErr w:type="spellStart"/>
-      <w:r>
-        <w:rPr>
-          <w:rFonts w:ascii="Gill Sans MT" w:hAnsi="Gill Sans MT"/>
-          <w:b/>
-          <w:bCs/>
-        </w:rPr>
-        <w:t>Views</w:t>
-      </w:r>
-      <w:proofErr w:type="spellEnd"/>
-      <w:r>
-        <w:rPr>
-          <w:rFonts w:ascii="Gill Sans MT" w:hAnsi="Gill Sans MT"/>
-          <w:b/>
-          <w:bCs/>
-        </w:rPr>
-        <w:t>/</w:t>
-      </w:r>
-      <w:proofErr w:type="spellStart"/>
-      <w:r>
-        <w:rPr>
-          <w:rFonts w:ascii="Gill Sans MT" w:hAnsi="Gill Sans MT"/>
-          <w:b/>
-          <w:bCs/>
-        </w:rPr>
-        <w:t>Shared</w:t>
-      </w:r>
-      <w:proofErr w:type="spellEnd"/>
-      <w:r>
-        <w:rPr>
-          <w:rFonts w:ascii="Gill Sans MT" w:hAnsi="Gill Sans MT"/>
-          <w:b/>
-          <w:bCs/>
-        </w:rPr>
-        <w:t>/_</w:t>
-      </w:r>
-      <w:proofErr w:type="spellStart"/>
-      <w:r>
-        <w:rPr>
-          <w:rFonts w:ascii="Gill Sans MT" w:hAnsi="Gill Sans MT"/>
-          <w:b/>
-          <w:bCs/>
-        </w:rPr>
-        <w:t>Layout.cshtml</w:t>
-      </w:r>
-      <w:proofErr w:type="spellEnd"/>
+        <w:t>/Views/Shared/_Layout.cshtml</w:t>
+      </w:r>
       <w:r>
         <w:rPr>
           <w:rFonts w:ascii="Gill Sans MT" w:hAnsi="Gill Sans MT"/>
@@ -1081,43 +949,7 @@
           <w:b/>
           <w:bCs/>
         </w:rPr>
-        <w:t>(/</w:t>
-      </w:r>
-      <w:proofErr w:type="spellStart"/>
-      <w:r>
-        <w:rPr>
-          <w:rFonts w:ascii="Gill Sans MT" w:hAnsi="Gill Sans MT"/>
-          <w:b/>
-          <w:bCs/>
-        </w:rPr>
-        <w:t>Views</w:t>
-      </w:r>
-      <w:proofErr w:type="spellEnd"/>
-      <w:r>
-        <w:rPr>
-          <w:rFonts w:ascii="Gill Sans MT" w:hAnsi="Gill Sans MT"/>
-          <w:b/>
-          <w:bCs/>
-        </w:rPr>
-        <w:t>/Home/</w:t>
-      </w:r>
-      <w:proofErr w:type="spellStart"/>
-      <w:r>
-        <w:rPr>
-          <w:rFonts w:ascii="Gill Sans MT" w:hAnsi="Gill Sans MT"/>
-          <w:b/>
-          <w:bCs/>
-        </w:rPr>
-        <w:t>Index.cshtml</w:t>
-      </w:r>
-      <w:proofErr w:type="spellEnd"/>
-      <w:r>
-        <w:rPr>
-          <w:rFonts w:ascii="Gill Sans MT" w:hAnsi="Gill Sans MT"/>
-          <w:b/>
-          <w:bCs/>
-        </w:rPr>
-        <w:t>)</w:t>
+        <w:t>(/Views/Home/Index.cshtml)</w:t>
       </w:r>
       <w:r>
         <w:rPr>
@@ -1211,43 +1043,7 @@
           <w:b/>
           <w:bCs/>
         </w:rPr>
-        <w:t>(/</w:t>
-      </w:r>
-      <w:proofErr w:type="spellStart"/>
-      <w:r>
-        <w:rPr>
-          <w:rFonts w:ascii="Gill Sans MT" w:hAnsi="Gill Sans MT"/>
-          <w:b/>
-          <w:bCs/>
-        </w:rPr>
-        <w:t>wwwroot</w:t>
-      </w:r>
-      <w:proofErr w:type="spellEnd"/>
-      <w:r>
-        <w:rPr>
-          <w:rFonts w:ascii="Gill Sans MT" w:hAnsi="Gill Sans MT"/>
-          <w:b/>
-          <w:bCs/>
-        </w:rPr>
-        <w:t>/</w:t>
-      </w:r>
-      <w:proofErr w:type="spellStart"/>
-      <w:r>
-        <w:rPr>
-          <w:rFonts w:ascii="Gill Sans MT" w:hAnsi="Gill Sans MT"/>
-          <w:b/>
-          <w:bCs/>
-        </w:rPr>
-        <w:t>css</w:t>
-      </w:r>
-      <w:proofErr w:type="spellEnd"/>
-      <w:r>
-        <w:rPr>
-          <w:rFonts w:ascii="Gill Sans MT" w:hAnsi="Gill Sans MT"/>
-          <w:b/>
-          <w:bCs/>
-        </w:rPr>
-        <w:t>/site.css)</w:t>
+        <w:t>(/wwwroot/css/site.css)</w:t>
       </w:r>
       <w:r>
         <w:rPr>
@@ -1372,18 +1168,8 @@
           <w:b/>
           <w:bCs/>
         </w:rPr>
-        <w:t>/</w:t>
-      </w:r>
-      <w:proofErr w:type="spellStart"/>
-      <w:r>
-        <w:rPr>
-          <w:rFonts w:ascii="Gill Sans MT" w:hAnsi="Gill Sans MT"/>
-          <w:b/>
-          <w:bCs/>
-        </w:rPr>
-        <w:t>wwwroot</w:t>
-      </w:r>
-      <w:proofErr w:type="spellEnd"/>
+        <w:t>/wwwroot</w:t>
+      </w:r>
       <w:r>
         <w:rPr>
           <w:rFonts w:ascii="Gill Sans MT" w:hAnsi="Gill Sans MT"/>
@@ -1706,7 +1492,6 @@
         </w:rPr>
         <w:t xml:space="preserve"> devra se nommer </w:t>
       </w:r>
-      <w:proofErr w:type="spellStart"/>
       <w:r>
         <w:rPr>
           <w:rFonts w:ascii="Gill Sans MT" w:hAnsi="Gill Sans MT"/>
@@ -1715,7 +1500,6 @@
         </w:rPr>
         <w:t>NutriVieEF</w:t>
       </w:r>
-      <w:proofErr w:type="spellEnd"/>
       <w:r>
         <w:rPr>
           <w:rFonts w:ascii="Gill Sans MT" w:hAnsi="Gill Sans MT"/>
@@ -1736,7 +1520,6 @@
         </w:rPr>
         <w:t xml:space="preserve"> pour votre </w:t>
       </w:r>
-      <w:proofErr w:type="spellStart"/>
       <w:r>
         <w:rPr>
           <w:rFonts w:ascii="Gill Sans MT" w:hAnsi="Gill Sans MT"/>
@@ -1745,7 +1528,6 @@
         </w:rPr>
         <w:t>DbContext</w:t>
       </w:r>
-      <w:proofErr w:type="spellEnd"/>
       <w:r>
         <w:rPr>
           <w:rFonts w:ascii="Gill Sans MT" w:hAnsi="Gill Sans MT"/>
@@ -1760,7 +1542,6 @@
         </w:rPr>
         <w:t xml:space="preserve">devra se nommer </w:t>
       </w:r>
-      <w:proofErr w:type="spellStart"/>
       <w:r>
         <w:rPr>
           <w:rFonts w:ascii="Gill Sans MT" w:hAnsi="Gill Sans MT"/>
@@ -1777,7 +1558,6 @@
         </w:rPr>
         <w:t>.cs</w:t>
       </w:r>
-      <w:proofErr w:type="spellEnd"/>
     </w:p>
     <w:p>
       <w:pPr>
@@ -2005,23 +1785,7 @@
           <w:b/>
           <w:bCs/>
         </w:rPr>
-        <w:t>/</w:t>
-      </w:r>
-      <w:proofErr w:type="spellStart"/>
-      <w:r>
-        <w:rPr>
-          <w:b/>
-          <w:bCs/>
-        </w:rPr>
-        <w:t>Models</w:t>
-      </w:r>
-      <w:proofErr w:type="spellEnd"/>
-      <w:r>
-        <w:rPr>
-          <w:b/>
-          <w:bCs/>
-        </w:rPr>
-        <w:t>/</w:t>
+        <w:t>/Models/</w:t>
       </w:r>
       <w:r>
         <w:t>,</w:t>
@@ -2063,13 +1827,8 @@
       <w:r>
         <w:t xml:space="preserve"> qui sera gérée par </w:t>
       </w:r>
-      <w:proofErr w:type="spellStart"/>
-      <w:r>
-        <w:t>Entity</w:t>
-      </w:r>
-      <w:proofErr w:type="spellEnd"/>
-      <w:r>
-        <w:t xml:space="preserve"> Framework (</w:t>
+      <w:r>
+        <w:t>Entity Framework (</w:t>
       </w:r>
       <w:r>
         <w:rPr>
@@ -2239,36 +1998,8 @@
           <w:b/>
           <w:bCs/>
         </w:rPr>
-        <w:t>/</w:t>
-      </w:r>
-      <w:proofErr w:type="spellStart"/>
-      <w:r>
-        <w:rPr>
-          <w:rFonts w:ascii="Gill Sans MT" w:hAnsi="Gill Sans MT"/>
-          <w:b/>
-          <w:bCs/>
-        </w:rPr>
-        <w:t>Views</w:t>
-      </w:r>
-      <w:proofErr w:type="spellEnd"/>
-      <w:r>
-        <w:rPr>
-          <w:rFonts w:ascii="Gill Sans MT" w:hAnsi="Gill Sans MT"/>
-          <w:b/>
-          <w:bCs/>
-        </w:rPr>
-        <w:t>/Home/</w:t>
-      </w:r>
-      <w:proofErr w:type="spellStart"/>
-      <w:r>
-        <w:rPr>
-          <w:rFonts w:ascii="Gill Sans MT" w:hAnsi="Gill Sans MT"/>
-          <w:b/>
-          <w:bCs/>
-        </w:rPr>
-        <w:t>Index.cshtml</w:t>
-      </w:r>
-      <w:proofErr w:type="spellEnd"/>
+        <w:t>/Views/Home/Index.cshtml</w:t>
+      </w:r>
       <w:r>
         <w:t>)</w:t>
       </w:r>
@@ -2278,21 +2009,12 @@
       <w:r>
         <w:t xml:space="preserve">. Nous utiliserons le contrôleur </w:t>
       </w:r>
-      <w:proofErr w:type="spellStart"/>
-      <w:r>
-        <w:rPr>
-          <w:b/>
-          <w:bCs/>
-        </w:rPr>
-        <w:t>HomeController</w:t>
-      </w:r>
-      <w:proofErr w:type="spellEnd"/>
-      <w:r>
-        <w:rPr>
-          <w:b/>
-          <w:bCs/>
-        </w:rPr>
-        <w:t xml:space="preserve"> </w:t>
+      <w:r>
+        <w:rPr>
+          <w:b/>
+          <w:bCs/>
+        </w:rPr>
+        <w:t xml:space="preserve">HomeController </w:t>
       </w:r>
       <w:r>
         <w:t>déjà présent (</w:t>
@@ -2302,33 +2024,8 @@
           <w:b/>
           <w:bCs/>
         </w:rPr>
-        <w:t>/</w:t>
-      </w:r>
-      <w:proofErr w:type="spellStart"/>
-      <w:r>
-        <w:rPr>
-          <w:b/>
-          <w:bCs/>
-        </w:rPr>
-        <w:t>Controllers</w:t>
-      </w:r>
-      <w:proofErr w:type="spellEnd"/>
-      <w:r>
-        <w:rPr>
-          <w:b/>
-          <w:bCs/>
-        </w:rPr>
-        <w:t>/</w:t>
-      </w:r>
-      <w:proofErr w:type="spellStart"/>
-      <w:r>
-        <w:rPr>
-          <w:b/>
-          <w:bCs/>
-        </w:rPr>
-        <w:t>HomeController.cs</w:t>
-      </w:r>
-      <w:proofErr w:type="spellEnd"/>
+        <w:t>/Controllers/HomeController.cs</w:t>
+      </w:r>
       <w:r>
         <w:t>).</w:t>
       </w:r>
@@ -2353,7 +2050,39 @@
       <w:r>
         <w:t xml:space="preserve">un </w:t>
       </w:r>
-      <w:proofErr w:type="spellStart"/>
+      <w:r>
+        <w:rPr>
+          <w:b/>
+          <w:bCs/>
+        </w:rPr>
+        <w:t>seed de données</w:t>
+      </w:r>
+      <w:r>
+        <w:t xml:space="preserve"> pour la </w:t>
+      </w:r>
+      <w:r>
+        <w:rPr>
+          <w:b/>
+          <w:bCs/>
+        </w:rPr>
+        <w:t>classe Service</w:t>
+      </w:r>
+      <w:r>
+        <w:rPr>
+          <w:b/>
+          <w:bCs/>
+        </w:rPr>
+        <w:t xml:space="preserve">. </w:t>
+      </w:r>
+      <w:r>
+        <w:t xml:space="preserve">Utilisez les informations des </w:t>
+      </w:r>
+      <w:r>
+        <w:t xml:space="preserve">trois </w:t>
+      </w:r>
+      <w:r>
+        <w:t xml:space="preserve">services disponibles sur la page d’accueil pour remplir votre </w:t>
+      </w:r>
       <w:r>
         <w:rPr>
           <w:b/>
@@ -2361,49 +2090,6 @@
         </w:rPr>
         <w:t>seed</w:t>
       </w:r>
-      <w:proofErr w:type="spellEnd"/>
-      <w:r>
-        <w:rPr>
-          <w:b/>
-          <w:bCs/>
-        </w:rPr>
-        <w:t xml:space="preserve"> de données</w:t>
-      </w:r>
-      <w:r>
-        <w:t xml:space="preserve"> pour la </w:t>
-      </w:r>
-      <w:r>
-        <w:rPr>
-          <w:b/>
-          <w:bCs/>
-        </w:rPr>
-        <w:t>classe Service</w:t>
-      </w:r>
-      <w:r>
-        <w:rPr>
-          <w:b/>
-          <w:bCs/>
-        </w:rPr>
-        <w:t xml:space="preserve">. </w:t>
-      </w:r>
-      <w:r>
-        <w:t xml:space="preserve">Utilisez les informations des </w:t>
-      </w:r>
-      <w:r>
-        <w:t xml:space="preserve">trois </w:t>
-      </w:r>
-      <w:r>
-        <w:t xml:space="preserve">services disponibles sur la page d’accueil pour remplir votre </w:t>
-      </w:r>
-      <w:proofErr w:type="spellStart"/>
-      <w:r>
-        <w:rPr>
-          <w:b/>
-          <w:bCs/>
-        </w:rPr>
-        <w:t>seed</w:t>
-      </w:r>
-      <w:proofErr w:type="spellEnd"/>
       <w:r>
         <w:t xml:space="preserve">. </w:t>
       </w:r>
@@ -2781,7 +2467,6 @@
       <w:r>
         <w:t xml:space="preserve"> l’action </w:t>
       </w:r>
-      <w:proofErr w:type="gramStart"/>
       <w:r>
         <w:rPr>
           <w:b/>
@@ -2801,34 +2486,17 @@
           <w:b/>
           <w:bCs/>
         </w:rPr>
-        <w:t>(</w:t>
-      </w:r>
-      <w:proofErr w:type="gramEnd"/>
-      <w:r>
-        <w:rPr>
-          <w:b/>
-          <w:bCs/>
-        </w:rPr>
-        <w:t xml:space="preserve">) </w:t>
+        <w:t xml:space="preserve">() </w:t>
       </w:r>
       <w:r>
         <w:t xml:space="preserve">du </w:t>
       </w:r>
-      <w:proofErr w:type="spellStart"/>
-      <w:r>
-        <w:rPr>
-          <w:b/>
-          <w:bCs/>
-        </w:rPr>
-        <w:t>HomeController</w:t>
-      </w:r>
-      <w:proofErr w:type="spellEnd"/>
-      <w:r>
-        <w:rPr>
-          <w:b/>
-          <w:bCs/>
-        </w:rPr>
-        <w:t xml:space="preserve"> </w:t>
+      <w:r>
+        <w:rPr>
+          <w:b/>
+          <w:bCs/>
+        </w:rPr>
+        <w:t xml:space="preserve">HomeController </w:t>
       </w:r>
       <w:r>
         <w:t xml:space="preserve">pour qu’elle </w:t>
@@ -2855,19 +2523,8 @@
           <w:b/>
           <w:bCs/>
         </w:rPr>
-        <w:t xml:space="preserve">vue </w:t>
-      </w:r>
-      <w:proofErr w:type="spellStart"/>
-      <w:proofErr w:type="gramStart"/>
-      <w:r>
-        <w:rPr>
-          <w:b/>
-          <w:bCs/>
-        </w:rPr>
-        <w:t>index.cshtml</w:t>
-      </w:r>
-      <w:proofErr w:type="spellEnd"/>
-      <w:proofErr w:type="gramEnd"/>
+        <w:t>vue index.cshtml</w:t>
+      </w:r>
     </w:p>
     <w:p>
       <w:pPr>
@@ -2907,23 +2564,12 @@
       <w:r>
         <w:t xml:space="preserve"> </w:t>
       </w:r>
-      <w:proofErr w:type="spellStart"/>
-      <w:proofErr w:type="gramStart"/>
-      <w:r>
-        <w:rPr>
-          <w:b/>
-          <w:bCs/>
-        </w:rPr>
-        <w:t>index.cshtml</w:t>
-      </w:r>
-      <w:proofErr w:type="spellEnd"/>
-      <w:proofErr w:type="gramEnd"/>
-      <w:r>
-        <w:rPr>
-          <w:b/>
-          <w:bCs/>
-        </w:rPr>
-        <w:t xml:space="preserve"> </w:t>
+      <w:r>
+        <w:rPr>
+          <w:b/>
+          <w:bCs/>
+        </w:rPr>
+        <w:t xml:space="preserve">index.cshtml </w:t>
       </w:r>
       <w:r>
         <w:t>pour qu</w:t>
@@ -2939,23 +2585,7 @@
           <w:b/>
           <w:bCs/>
         </w:rPr>
-        <w:t xml:space="preserve">données retournées par l’action </w:t>
-      </w:r>
-      <w:proofErr w:type="gramStart"/>
-      <w:r>
-        <w:rPr>
-          <w:b/>
-          <w:bCs/>
-        </w:rPr>
-        <w:t>Index(</w:t>
-      </w:r>
-      <w:proofErr w:type="gramEnd"/>
-      <w:r>
-        <w:rPr>
-          <w:b/>
-          <w:bCs/>
-        </w:rPr>
-        <w:t>).</w:t>
+        <w:t>données retournées par l’action Index().</w:t>
       </w:r>
       <w:r>
         <w:rPr>
@@ -3218,7 +2848,6 @@
       <w:r>
         <w:t xml:space="preserve"> nommée </w:t>
       </w:r>
-      <w:proofErr w:type="spellStart"/>
       <w:r>
         <w:rPr>
           <w:b/>
@@ -3226,7 +2855,6 @@
         </w:rPr>
         <w:t>Categorie</w:t>
       </w:r>
-      <w:proofErr w:type="spellEnd"/>
       <w:r>
         <w:t xml:space="preserve"> et copi</w:t>
       </w:r>
@@ -3548,7 +3176,6 @@
       <w:r>
         <w:t xml:space="preserve"> </w:t>
       </w:r>
-      <w:proofErr w:type="spellStart"/>
       <w:r>
         <w:rPr>
           <w:b/>
@@ -3556,7 +3183,6 @@
         </w:rPr>
         <w:t>seed</w:t>
       </w:r>
-      <w:proofErr w:type="spellEnd"/>
       <w:r>
         <w:t xml:space="preserve"> de données pour </w:t>
       </w:r>
@@ -3717,15 +3343,7 @@
         <w:t xml:space="preserve"> et Recettes</w:t>
       </w:r>
       <w:r>
-        <w:t xml:space="preserve"> des menus de navigation (header et </w:t>
-      </w:r>
-      <w:proofErr w:type="spellStart"/>
-      <w:r>
-        <w:t>footer</w:t>
-      </w:r>
-      <w:proofErr w:type="spellEnd"/>
-      <w:r>
-        <w:t>) mènent vers l</w:t>
+        <w:t xml:space="preserve"> des menus de navigation (header et footer) mènent vers l</w:t>
       </w:r>
       <w:r>
         <w:t>es</w:t>
@@ -4011,11 +3629,7 @@
         <w:jc w:val="both"/>
       </w:pPr>
       <w:r>
-        <w:t xml:space="preserve">Affichez le nom de la catégorie plutôt que </w:t>
-      </w:r>
-      <w:proofErr w:type="spellStart"/>
-      <w:r>
-        <w:t>l</w:t>
+        <w:t>Affichez le nom de la catégorie plutôt que l</w:t>
       </w:r>
       <w:r>
         <w:t>’</w:t>
@@ -4023,7 +3637,6 @@
       <w:r>
         <w:t>Id</w:t>
       </w:r>
-      <w:proofErr w:type="spellEnd"/>
     </w:p>
     <w:p>
       <w:pPr>
@@ -4057,15 +3670,7 @@
         <w:t xml:space="preserve"> si elles sont présentes</w:t>
       </w:r>
       <w:r>
-        <w:t xml:space="preserve"> (style </w:t>
-      </w:r>
-      <w:proofErr w:type="spellStart"/>
-      <w:r>
-        <w:t>intraligne</w:t>
-      </w:r>
-      <w:proofErr w:type="spellEnd"/>
-      <w:r>
-        <w:t>)</w:t>
+        <w:t xml:space="preserve"> (style intraligne)</w:t>
       </w:r>
     </w:p>
     <w:p>
@@ -4084,15 +3689,7 @@
         <w:t>z</w:t>
       </w:r>
       <w:r>
-        <w:t xml:space="preserve"> la largeur du contenu de la colonne Description à 250 px (style </w:t>
-      </w:r>
-      <w:proofErr w:type="spellStart"/>
-      <w:r>
-        <w:t>intraligne</w:t>
-      </w:r>
-      <w:proofErr w:type="spellEnd"/>
-      <w:r>
-        <w:t>)</w:t>
+        <w:t xml:space="preserve"> la largeur du contenu de la colonne Description à 250 px (style intraligne)</w:t>
       </w:r>
     </w:p>
     <w:p>
@@ -4105,23 +3702,7 @@
         <w:jc w:val="both"/>
       </w:pPr>
       <w:r>
-        <w:t xml:space="preserve">Changez les entêtes </w:t>
-      </w:r>
-      <w:proofErr w:type="spellStart"/>
-      <w:r>
-        <w:t>TempsPreparation</w:t>
-      </w:r>
-      <w:proofErr w:type="spellEnd"/>
-      <w:r>
-        <w:t xml:space="preserve"> et </w:t>
-      </w:r>
-      <w:proofErr w:type="spellStart"/>
-      <w:r>
-        <w:t>TempsCuisson</w:t>
-      </w:r>
-      <w:proofErr w:type="spellEnd"/>
-      <w:r>
-        <w:t xml:space="preserve"> du tableau par « Durée (min) » et « Cuisson (min) »</w:t>
+        <w:t>Changez les entêtes TempsPreparation et TempsCuisson du tableau par « Durée (min) » et « Cuisson (min) »</w:t>
       </w:r>
     </w:p>
     <w:p>
@@ -4146,7 +3727,7 @@
           <w:noProof/>
         </w:rPr>
         <w:drawing>
-          <wp:anchor distT="0" distB="0" distL="114300" distR="114300" simplePos="0" relativeHeight="251652096" behindDoc="0" locked="0" layoutInCell="1" allowOverlap="1" wp14:anchorId="1E096A02" wp14:editId="03596BA3">
+          <wp:anchor distT="0" distB="0" distL="114300" distR="114300" simplePos="0" relativeHeight="251652096" behindDoc="0" locked="0" layoutInCell="1" allowOverlap="1" wp14:anchorId="1E096A02" wp14:editId="5DC809C3">
             <wp:simplePos x="0" y="0"/>
             <wp:positionH relativeFrom="column">
               <wp:posOffset>802592</wp:posOffset>
@@ -4302,23 +3883,7 @@
         <w:t>Si ce n’est pas déjà le cas, c</w:t>
       </w:r>
       <w:r>
-        <w:t xml:space="preserve">hangez les titres </w:t>
-      </w:r>
-      <w:proofErr w:type="spellStart"/>
-      <w:r>
-        <w:t>TempsPreparation</w:t>
-      </w:r>
-      <w:proofErr w:type="spellEnd"/>
-      <w:r>
-        <w:t xml:space="preserve"> et </w:t>
-      </w:r>
-      <w:proofErr w:type="spellStart"/>
-      <w:r>
-        <w:t>TempsCuisson</w:t>
-      </w:r>
-      <w:proofErr w:type="spellEnd"/>
-      <w:r>
-        <w:t xml:space="preserve"> du tableau par « Durée (min) » et « Cuisson (min) »</w:t>
+        <w:t>hangez les titres TempsPreparation et TempsCuisson du tableau par « Durée (min) » et « Cuisson (min) »</w:t>
       </w:r>
     </w:p>
     <w:p>
@@ -4422,23 +3987,7 @@
           <w:b/>
           <w:bCs/>
         </w:rPr>
-        <w:t xml:space="preserve">Dans la vue </w:t>
-      </w:r>
-      <w:proofErr w:type="spellStart"/>
-      <w:r>
-        <w:rPr>
-          <w:b/>
-          <w:bCs/>
-        </w:rPr>
-        <w:t>Delete</w:t>
-      </w:r>
-      <w:proofErr w:type="spellEnd"/>
-      <w:r>
-        <w:rPr>
-          <w:b/>
-          <w:bCs/>
-        </w:rPr>
-        <w:t xml:space="preserve"> </w:t>
+        <w:t xml:space="preserve">Dans la vue Delete </w:t>
       </w:r>
     </w:p>
     <w:p>
@@ -4601,17 +4150,8 @@
           <w:b/>
           <w:bCs/>
         </w:rPr>
-        <w:t xml:space="preserve">et </w:t>
-      </w:r>
-      <w:proofErr w:type="spellStart"/>
-      <w:r>
-        <w:rPr>
-          <w:b/>
-          <w:bCs/>
-        </w:rPr>
-        <w:t>Create</w:t>
-      </w:r>
-      <w:proofErr w:type="spellEnd"/>
+        <w:t>et Create</w:t>
+      </w:r>
     </w:p>
     <w:p>
       <w:pPr>
@@ -4647,15 +4187,7 @@
         <w:t>plutôt que</w:t>
       </w:r>
       <w:r>
-        <w:t xml:space="preserve"> « </w:t>
-      </w:r>
-      <w:proofErr w:type="spellStart"/>
-      <w:r>
-        <w:t>CategorieId</w:t>
-      </w:r>
-      <w:proofErr w:type="spellEnd"/>
-      <w:r>
-        <w:t> »</w:t>
+        <w:t xml:space="preserve"> « CategorieId »</w:t>
       </w:r>
       <w:r>
         <w:t>.</w:t>
@@ -5880,17 +5412,8 @@
           <w:b/>
           <w:bCs/>
         </w:rPr>
-        <w:t xml:space="preserve"> </w:t>
-      </w:r>
-      <w:proofErr w:type="spellStart"/>
-      <w:r>
-        <w:rPr>
-          <w:b/>
-          <w:bCs/>
-        </w:rPr>
-        <w:t>Create</w:t>
-      </w:r>
-      <w:proofErr w:type="spellEnd"/>
+        <w:t xml:space="preserve"> Create</w:t>
+      </w:r>
       <w:r>
         <w:t xml:space="preserve">, </w:t>
       </w:r>
@@ -5904,7 +5427,6 @@
       <w:r>
         <w:t xml:space="preserve">et </w:t>
       </w:r>
-      <w:proofErr w:type="spellStart"/>
       <w:r>
         <w:rPr>
           <w:b/>
@@ -5912,7 +5434,6 @@
         </w:rPr>
         <w:t>Delete</w:t>
       </w:r>
-      <w:proofErr w:type="spellEnd"/>
       <w:r>
         <w:t xml:space="preserve"> ainsi que le bouton </w:t>
       </w:r>
@@ -5954,19 +5475,9 @@
         </w:numPr>
         <w:jc w:val="both"/>
       </w:pPr>
-      <w:proofErr w:type="spellStart"/>
-      <w:r>
-        <w:t>Categories</w:t>
-      </w:r>
-      <w:proofErr w:type="spellEnd"/>
-      <w:r>
-        <w:t>/</w:t>
-      </w:r>
-      <w:proofErr w:type="spellStart"/>
-      <w:r>
-        <w:t>Create</w:t>
-      </w:r>
-      <w:proofErr w:type="spellEnd"/>
+      <w:r>
+        <w:t>Categories/Create</w:t>
+      </w:r>
     </w:p>
     <w:p>
       <w:pPr>
@@ -5977,13 +5488,8 @@
         </w:numPr>
         <w:jc w:val="both"/>
       </w:pPr>
-      <w:proofErr w:type="spellStart"/>
-      <w:r>
-        <w:t>Categories</w:t>
-      </w:r>
-      <w:proofErr w:type="spellEnd"/>
-      <w:r>
-        <w:t xml:space="preserve"> /Edit</w:t>
+      <w:r>
+        <w:t>Categories /Edit</w:t>
       </w:r>
     </w:p>
     <w:p>
@@ -5995,19 +5501,9 @@
         </w:numPr>
         <w:jc w:val="both"/>
       </w:pPr>
-      <w:proofErr w:type="spellStart"/>
-      <w:r>
-        <w:t>Categories</w:t>
-      </w:r>
-      <w:proofErr w:type="spellEnd"/>
-      <w:r>
-        <w:t xml:space="preserve"> /</w:t>
-      </w:r>
-      <w:proofErr w:type="spellStart"/>
-      <w:r>
-        <w:t>Delete</w:t>
-      </w:r>
-      <w:proofErr w:type="spellEnd"/>
+      <w:r>
+        <w:t>Categories /Delete</w:t>
+      </w:r>
     </w:p>
     <w:p>
       <w:pPr>
@@ -6019,13 +5515,8 @@
         <w:jc w:val="both"/>
       </w:pPr>
       <w:r>
-        <w:t>Recettes/</w:t>
-      </w:r>
-      <w:proofErr w:type="spellStart"/>
-      <w:r>
-        <w:t>Create</w:t>
-      </w:r>
-      <w:proofErr w:type="spellEnd"/>
+        <w:t>Recettes/Create</w:t>
+      </w:r>
     </w:p>
     <w:p>
       <w:pPr>
@@ -6050,13 +5541,8 @@
         <w:jc w:val="both"/>
       </w:pPr>
       <w:r>
-        <w:t>Recettes /</w:t>
-      </w:r>
-      <w:proofErr w:type="spellStart"/>
-      <w:r>
-        <w:t>Delete</w:t>
-      </w:r>
-      <w:proofErr w:type="spellEnd"/>
+        <w:t>Recettes /Delete</w:t>
+      </w:r>
     </w:p>
     <w:p>
       <w:pPr>
@@ -6125,23 +5611,7 @@
         <w:t>différentes</w:t>
       </w:r>
       <w:r>
-        <w:t xml:space="preserve"> pour cette section, car il existe 3 actions (</w:t>
-      </w:r>
-      <w:proofErr w:type="spellStart"/>
-      <w:r>
-        <w:t>Create</w:t>
-      </w:r>
-      <w:proofErr w:type="spellEnd"/>
-      <w:r>
-        <w:t xml:space="preserve">, Edit et </w:t>
-      </w:r>
-      <w:proofErr w:type="spellStart"/>
-      <w:r>
-        <w:t>Delete</w:t>
-      </w:r>
-      <w:proofErr w:type="spellEnd"/>
-      <w:r>
-        <w:t>)</w:t>
+        <w:t xml:space="preserve"> pour cette section, car il existe 3 actions (Create, Edit et Delete)</w:t>
       </w:r>
       <w:r>
         <w:t>. Chacune de ces vues</w:t>
@@ -6214,31 +5684,13 @@
         </w:rPr>
         <w:t xml:space="preserve">Pour </w:t>
       </w:r>
-      <w:proofErr w:type="spellStart"/>
-      <w:r>
-        <w:rPr>
-          <w:b/>
-          <w:bCs/>
-        </w:rPr>
-        <w:t>Categories</w:t>
-      </w:r>
-      <w:proofErr w:type="spellEnd"/>
-      <w:r>
-        <w:rPr>
-          <w:b/>
-          <w:bCs/>
-        </w:rPr>
-        <w:t>/</w:t>
-      </w:r>
-      <w:proofErr w:type="spellStart"/>
-      <w:r>
-        <w:rPr>
-          <w:b/>
-          <w:bCs/>
-        </w:rPr>
-        <w:t>Create</w:t>
-      </w:r>
-      <w:proofErr w:type="spellEnd"/>
+      <w:r>
+        <w:rPr>
+          <w:b/>
+          <w:bCs/>
+        </w:rPr>
+        <w:t>Categories/Create</w:t>
+      </w:r>
       <w:r>
         <w:t>,</w:t>
       </w:r>
@@ -6250,17 +5702,8 @@
           <w:b/>
           <w:bCs/>
         </w:rPr>
-        <w:t>Recettes/</w:t>
-      </w:r>
-      <w:proofErr w:type="spellStart"/>
-      <w:r>
-        <w:rPr>
-          <w:b/>
-          <w:bCs/>
-        </w:rPr>
-        <w:t>Create</w:t>
-      </w:r>
-      <w:proofErr w:type="spellEnd"/>
+        <w:t>Recettes/Create</w:t>
+      </w:r>
       <w:r>
         <w:rPr>
           <w:b/>
@@ -6295,21 +5738,12 @@
       <w:r>
         <w:t xml:space="preserve">la classe </w:t>
       </w:r>
-      <w:proofErr w:type="spellStart"/>
-      <w:r>
-        <w:rPr>
-          <w:b/>
-          <w:bCs/>
-        </w:rPr>
-        <w:t>form</w:t>
-      </w:r>
-      <w:proofErr w:type="spellEnd"/>
-      <w:r>
-        <w:rPr>
-          <w:b/>
-          <w:bCs/>
-        </w:rPr>
-        <w:t>-group</w:t>
+      <w:r>
+        <w:rPr>
+          <w:b/>
+          <w:bCs/>
+        </w:rPr>
+        <w:t>form-group</w:t>
       </w:r>
       <w:r>
         <w:t xml:space="preserve"> du div contenant la vue partielle par la classe </w:t>
@@ -6319,17 +5753,8 @@
           <w:b/>
           <w:bCs/>
         </w:rPr>
-        <w:t>d-</w:t>
-      </w:r>
-      <w:proofErr w:type="spellStart"/>
-      <w:r>
-        <w:rPr>
-          <w:b/>
-          <w:bCs/>
-        </w:rPr>
-        <w:t>flex</w:t>
-      </w:r>
-      <w:proofErr w:type="spellEnd"/>
+        <w:t>d-flex</w:t>
+      </w:r>
       <w:r>
         <w:rPr>
           <w:b/>
@@ -6429,7 +5854,6 @@
       <w:r>
         <w:t xml:space="preserve">s </w:t>
       </w:r>
-      <w:proofErr w:type="spellStart"/>
       <w:r>
         <w:rPr>
           <w:b/>
@@ -6437,7 +5861,6 @@
         </w:rPr>
         <w:t>btn</w:t>
       </w:r>
-      <w:proofErr w:type="spellEnd"/>
       <w:r>
         <w:rPr>
           <w:b/>
@@ -6453,23 +5876,7 @@
           <w:b/>
           <w:bCs/>
         </w:rPr>
-        <w:t xml:space="preserve"> </w:t>
-      </w:r>
-      <w:proofErr w:type="spellStart"/>
-      <w:r>
-        <w:rPr>
-          <w:b/>
-          <w:bCs/>
-        </w:rPr>
-        <w:t>btn-secondary</w:t>
-      </w:r>
-      <w:proofErr w:type="spellEnd"/>
-      <w:r>
-        <w:rPr>
-          <w:b/>
-          <w:bCs/>
-        </w:rPr>
-        <w:t xml:space="preserve"> </w:t>
+        <w:t xml:space="preserve"> btn-secondary </w:t>
       </w:r>
       <w:r>
         <w:t>sur le bouton d’action Back to List</w:t>
@@ -6925,23 +6332,13 @@
         <w:lastRenderedPageBreak/>
         <w:t xml:space="preserve">Pour </w:t>
       </w:r>
-      <w:proofErr w:type="spellStart"/>
-      <w:r>
-        <w:rPr>
-          <w:b/>
-          <w:bCs/>
-        </w:rPr>
-        <w:t>Categories</w:t>
-      </w:r>
-      <w:proofErr w:type="spellEnd"/>
-      <w:r>
-        <w:rPr>
-          <w:b/>
-          <w:bCs/>
-        </w:rPr>
-        <w:t>/</w:t>
-      </w:r>
-      <w:proofErr w:type="spellStart"/>
+      <w:r>
+        <w:rPr>
+          <w:b/>
+          <w:bCs/>
+        </w:rPr>
+        <w:t>Categories/</w:t>
+      </w:r>
       <w:r>
         <w:rPr>
           <w:b/>
@@ -6949,7 +6346,6 @@
         </w:rPr>
         <w:t>Delete</w:t>
       </w:r>
-      <w:proofErr w:type="spellEnd"/>
       <w:r>
         <w:t xml:space="preserve">, </w:t>
       </w:r>
@@ -6960,21 +6356,12 @@
         </w:rPr>
         <w:t>Recettes/</w:t>
       </w:r>
-      <w:proofErr w:type="spellStart"/>
-      <w:r>
-        <w:rPr>
-          <w:b/>
-          <w:bCs/>
-        </w:rPr>
-        <w:t>Delete</w:t>
-      </w:r>
-      <w:proofErr w:type="spellEnd"/>
-      <w:r>
-        <w:rPr>
-          <w:b/>
-          <w:bCs/>
-        </w:rPr>
-        <w:t xml:space="preserve"> et la vue partielle associée </w:t>
+      <w:r>
+        <w:rPr>
+          <w:b/>
+          <w:bCs/>
+        </w:rPr>
+        <w:t xml:space="preserve">Delete et la vue partielle associée </w:t>
       </w:r>
     </w:p>
     <w:p>
@@ -7005,7 +6392,6 @@
       <w:r>
         <w:t xml:space="preserve">s </w:t>
       </w:r>
-      <w:proofErr w:type="spellStart"/>
       <w:r>
         <w:rPr>
           <w:b/>
@@ -7013,7 +6399,6 @@
         </w:rPr>
         <w:t>btn</w:t>
       </w:r>
-      <w:proofErr w:type="spellEnd"/>
       <w:r>
         <w:rPr>
           <w:b/>
@@ -7029,23 +6414,7 @@
           <w:b/>
           <w:bCs/>
         </w:rPr>
-        <w:t xml:space="preserve"> </w:t>
-      </w:r>
-      <w:proofErr w:type="spellStart"/>
-      <w:r>
-        <w:rPr>
-          <w:b/>
-          <w:bCs/>
-        </w:rPr>
-        <w:t>btn-secondary</w:t>
-      </w:r>
-      <w:proofErr w:type="spellEnd"/>
-      <w:r>
-        <w:rPr>
-          <w:b/>
-          <w:bCs/>
-        </w:rPr>
-        <w:t xml:space="preserve"> </w:t>
+        <w:t xml:space="preserve"> btn-secondary </w:t>
       </w:r>
       <w:r>
         <w:t xml:space="preserve">sur le bouton d’action </w:t>
@@ -7089,15 +6458,7 @@
         <w:t>etirez</w:t>
       </w:r>
       <w:r>
-        <w:t xml:space="preserve"> le symbole pipe </w:t>
-      </w:r>
-      <w:proofErr w:type="gramStart"/>
-      <w:r>
-        <w:t>( |</w:t>
-      </w:r>
-      <w:proofErr w:type="gramEnd"/>
-      <w:r>
-        <w:t xml:space="preserve"> ).</w:t>
+        <w:t xml:space="preserve"> le symbole pipe ( | ).</w:t>
       </w:r>
     </w:p>
     <w:p>
@@ -7347,21 +6708,12 @@
         </w:rPr>
         <w:t xml:space="preserve">Pour </w:t>
       </w:r>
-      <w:proofErr w:type="spellStart"/>
-      <w:r>
-        <w:rPr>
-          <w:b/>
-          <w:bCs/>
-        </w:rPr>
-        <w:t>Categories</w:t>
-      </w:r>
-      <w:proofErr w:type="spellEnd"/>
-      <w:r>
-        <w:rPr>
-          <w:b/>
-          <w:bCs/>
-        </w:rPr>
-        <w:t>/</w:t>
+      <w:r>
+        <w:rPr>
+          <w:b/>
+          <w:bCs/>
+        </w:rPr>
+        <w:t>Categories/</w:t>
       </w:r>
       <w:r>
         <w:rPr>
@@ -7424,7 +6776,6 @@
       <w:r>
         <w:t xml:space="preserve"> que pour </w:t>
       </w:r>
-      <w:proofErr w:type="spellStart"/>
       <w:r>
         <w:rPr>
           <w:b/>
@@ -7432,7 +6783,6 @@
         </w:rPr>
         <w:t>Create</w:t>
       </w:r>
-      <w:proofErr w:type="spellEnd"/>
       <w:r>
         <w:rPr>
           <w:b/>
@@ -7732,7 +7082,6 @@
       <w:r>
         <w:t>tilisez </w:t>
       </w:r>
-      <w:proofErr w:type="spellStart"/>
       <w:r>
         <w:rPr>
           <w:b/>
@@ -7740,7 +7089,6 @@
         </w:rPr>
         <w:t>FontAwesome</w:t>
       </w:r>
-      <w:proofErr w:type="spellEnd"/>
       <w:r>
         <w:t> pour les boutons suivants</w:t>
       </w:r>
@@ -8075,7 +7423,6 @@
       <w:r>
         <w:t xml:space="preserve"> du dossier </w:t>
       </w:r>
-      <w:proofErr w:type="spellStart"/>
       <w:r>
         <w:rPr>
           <w:b/>
@@ -8083,7 +7430,6 @@
         </w:rPr>
         <w:t>Fichiers_section_Linq</w:t>
       </w:r>
-      <w:proofErr w:type="spellEnd"/>
       <w:r>
         <w:t xml:space="preserve">. </w:t>
       </w:r>
@@ -8183,21 +7529,12 @@
       <w:r>
         <w:t xml:space="preserve"> le </w:t>
       </w:r>
-      <w:proofErr w:type="spellStart"/>
-      <w:r>
-        <w:rPr>
-          <w:b/>
-          <w:bCs/>
-        </w:rPr>
-        <w:t>seed</w:t>
-      </w:r>
-      <w:proofErr w:type="spellEnd"/>
-      <w:r>
-        <w:rPr>
-          <w:b/>
-          <w:bCs/>
-        </w:rPr>
-        <w:t xml:space="preserve"> </w:t>
+      <w:r>
+        <w:rPr>
+          <w:b/>
+          <w:bCs/>
+        </w:rPr>
+        <w:t xml:space="preserve">seed </w:t>
       </w:r>
       <w:r>
         <w:t xml:space="preserve">pour </w:t>
@@ -8227,23 +7564,7 @@
           <w:b/>
           <w:bCs/>
         </w:rPr>
-        <w:t xml:space="preserve"> </w:t>
-      </w:r>
-      <w:proofErr w:type="spellStart"/>
-      <w:r>
-        <w:rPr>
-          <w:b/>
-          <w:bCs/>
-        </w:rPr>
-        <w:t>DbSet</w:t>
-      </w:r>
-      <w:proofErr w:type="spellEnd"/>
-      <w:r>
-        <w:rPr>
-          <w:b/>
-          <w:bCs/>
-        </w:rPr>
-        <w:t xml:space="preserve">. </w:t>
+        <w:t xml:space="preserve"> DbSet. </w:t>
       </w:r>
     </w:p>
     <w:p>
@@ -8292,9 +7613,56 @@
           <w:b/>
           <w:bCs/>
         </w:rPr>
-        <w:t xml:space="preserve">table associative </w:t>
-      </w:r>
-      <w:proofErr w:type="spellStart"/>
+        <w:t xml:space="preserve">table associative AlimentRecette </w:t>
+      </w:r>
+      <w:r>
+        <w:rPr>
+          <w:b/>
+          <w:bCs/>
+        </w:rPr>
+        <w:t>a été ajoutée</w:t>
+      </w:r>
+      <w:r>
+        <w:t xml:space="preserve"> dans la BD. </w:t>
+      </w:r>
+      <w:r>
+        <w:t xml:space="preserve">Nous allons </w:t>
+      </w:r>
+      <w:r>
+        <w:t>créer</w:t>
+      </w:r>
+      <w:r>
+        <w:t xml:space="preserve"> cette table</w:t>
+      </w:r>
+      <w:r>
+        <w:t xml:space="preserve"> manuellement</w:t>
+      </w:r>
+      <w:r>
+        <w:t xml:space="preserve"> pour y stocker de l’information. </w:t>
+      </w:r>
+      <w:r>
+        <w:t xml:space="preserve">Créez une nouvelle </w:t>
+      </w:r>
+      <w:r>
+        <w:rPr>
+          <w:b/>
+          <w:bCs/>
+        </w:rPr>
+        <w:t>classe</w:t>
+      </w:r>
+      <w:r>
+        <w:t xml:space="preserve"> </w:t>
+      </w:r>
+      <w:r>
+        <w:rPr>
+          <w:b/>
+          <w:bCs/>
+        </w:rPr>
+        <w:t>nommée</w:t>
+      </w:r>
+      <w:r>
+        <w:t xml:space="preserve"> </w:t>
+      </w:r>
       <w:r>
         <w:rPr>
           <w:b/>
@@ -8302,7 +7670,6 @@
         </w:rPr>
         <w:t>AlimentRecette</w:t>
       </w:r>
-      <w:proofErr w:type="spellEnd"/>
       <w:r>
         <w:rPr>
           <w:b/>
@@ -8311,112 +7678,48 @@
         <w:t xml:space="preserve"> </w:t>
       </w:r>
       <w:r>
-        <w:rPr>
-          <w:b/>
-          <w:bCs/>
-        </w:rPr>
-        <w:t>a été ajoutée</w:t>
-      </w:r>
-      <w:r>
-        <w:t xml:space="preserve"> dans la BD. </w:t>
-      </w:r>
-      <w:r>
-        <w:t xml:space="preserve">Nous allons </w:t>
-      </w:r>
-      <w:r>
-        <w:t>créer</w:t>
-      </w:r>
-      <w:r>
-        <w:t xml:space="preserve"> cette table</w:t>
-      </w:r>
-      <w:r>
-        <w:t xml:space="preserve"> manuellement</w:t>
-      </w:r>
-      <w:r>
-        <w:t xml:space="preserve"> pour y stocker de l’information. </w:t>
-      </w:r>
-      <w:r>
-        <w:t xml:space="preserve">Créez une nouvelle </w:t>
-      </w:r>
-      <w:r>
-        <w:rPr>
-          <w:b/>
-          <w:bCs/>
-        </w:rPr>
-        <w:t>classe</w:t>
-      </w:r>
-      <w:r>
+        <w:t xml:space="preserve">et </w:t>
+      </w:r>
+      <w:r>
+        <w:t xml:space="preserve">utilisez le code fourni dans le fichier </w:t>
+      </w:r>
+      <w:r>
+        <w:rPr>
+          <w:b/>
+          <w:bCs/>
+        </w:rPr>
+        <w:t>Classe_Aliment</w:t>
+      </w:r>
+      <w:r>
+        <w:rPr>
+          <w:b/>
+          <w:bCs/>
+        </w:rPr>
+        <w:t>Recette</w:t>
+      </w:r>
+      <w:r>
+        <w:rPr>
+          <w:b/>
+          <w:bCs/>
+        </w:rPr>
+        <w:t>.txt</w:t>
+      </w:r>
+      <w:r>
+        <w:rPr>
+          <w:b/>
+          <w:bCs/>
+        </w:rPr>
+        <w:t>.</w:t>
+      </w:r>
+      <w:r>
+        <w:rPr>
+          <w:b/>
+          <w:bCs/>
+        </w:rPr>
         <w:t xml:space="preserve"> </w:t>
       </w:r>
       <w:r>
         <w:rPr>
-          <w:b/>
-          <w:bCs/>
-        </w:rPr>
-        <w:t>nommée</w:t>
-      </w:r>
-      <w:r>
-        <w:t xml:space="preserve"> </w:t>
-      </w:r>
-      <w:proofErr w:type="spellStart"/>
-      <w:r>
-        <w:rPr>
-          <w:b/>
-          <w:bCs/>
-        </w:rPr>
-        <w:t>AlimentRecette</w:t>
-      </w:r>
-      <w:proofErr w:type="spellEnd"/>
-      <w:r>
-        <w:rPr>
-          <w:b/>
-          <w:bCs/>
-        </w:rPr>
-        <w:t xml:space="preserve"> </w:t>
-      </w:r>
-      <w:r>
-        <w:t xml:space="preserve">et </w:t>
-      </w:r>
-      <w:r>
-        <w:t xml:space="preserve">utilisez le code fourni dans le fichier </w:t>
-      </w:r>
-      <w:r>
-        <w:rPr>
-          <w:b/>
-          <w:bCs/>
-        </w:rPr>
-        <w:t>Classe_Aliment</w:t>
-      </w:r>
-      <w:r>
-        <w:rPr>
-          <w:b/>
-          <w:bCs/>
-        </w:rPr>
-        <w:t>Recette</w:t>
-      </w:r>
-      <w:r>
-        <w:rPr>
-          <w:b/>
-          <w:bCs/>
-        </w:rPr>
-        <w:t>.txt</w:t>
-      </w:r>
-      <w:r>
-        <w:rPr>
-          <w:b/>
-          <w:bCs/>
-        </w:rPr>
-        <w:t>.</w:t>
-      </w:r>
-      <w:r>
-        <w:rPr>
-          <w:b/>
-          <w:bCs/>
-        </w:rPr>
-        <w:t xml:space="preserve"> </w:t>
-      </w:r>
-      <w:r>
-        <w:rPr>
           <w:rFonts w:ascii="Segoe UI Emoji" w:hAnsi="Segoe UI Emoji" w:cs="Segoe UI Emoji"/>
           <w:b/>
           <w:bCs/>
@@ -8431,13 +7734,8 @@
         <w:t>Attention</w:t>
       </w:r>
       <w:r>
-        <w:t xml:space="preserve">, ne rajoutez pas de clé primaire à cette classe, une clé composée est déjà définie dans la création du </w:t>
-      </w:r>
-      <w:proofErr w:type="spellStart"/>
-      <w:r>
-        <w:t>dbContext</w:t>
-      </w:r>
-      <w:proofErr w:type="spellEnd"/>
+        <w:t>, ne rajoutez pas de clé primaire à cette classe, une clé composée est déjà définie dans la création du dbContext</w:t>
+      </w:r>
       <w:r>
         <w:t>.</w:t>
       </w:r>
@@ -8466,26 +7764,16 @@
       <w:r>
         <w:t xml:space="preserve"> le </w:t>
       </w:r>
-      <w:proofErr w:type="spellStart"/>
-      <w:r>
-        <w:rPr>
-          <w:b/>
-          <w:bCs/>
-        </w:rPr>
-        <w:t>seed</w:t>
-      </w:r>
-      <w:proofErr w:type="spellEnd"/>
-      <w:r>
-        <w:rPr>
-          <w:b/>
-          <w:bCs/>
-        </w:rPr>
-        <w:t xml:space="preserve"> </w:t>
+      <w:r>
+        <w:rPr>
+          <w:b/>
+          <w:bCs/>
+        </w:rPr>
+        <w:t xml:space="preserve">seed </w:t>
       </w:r>
       <w:r>
         <w:t xml:space="preserve">pour </w:t>
       </w:r>
-      <w:proofErr w:type="spellStart"/>
       <w:r>
         <w:rPr>
           <w:b/>
@@ -8500,7 +7788,6 @@
         </w:rPr>
         <w:t>Recette</w:t>
       </w:r>
-      <w:proofErr w:type="spellEnd"/>
       <w:r>
         <w:t xml:space="preserve"> contenu dans le fichier </w:t>
       </w:r>
@@ -8533,23 +7820,7 @@
           <w:b/>
           <w:bCs/>
         </w:rPr>
-        <w:t xml:space="preserve"> </w:t>
-      </w:r>
-      <w:proofErr w:type="spellStart"/>
-      <w:r>
-        <w:rPr>
-          <w:b/>
-          <w:bCs/>
-        </w:rPr>
-        <w:t>DbSet</w:t>
-      </w:r>
-      <w:proofErr w:type="spellEnd"/>
-      <w:r>
-        <w:rPr>
-          <w:b/>
-          <w:bCs/>
-        </w:rPr>
-        <w:t xml:space="preserve">. </w:t>
+        <w:t xml:space="preserve"> DbSet. </w:t>
       </w:r>
       <w:r>
         <w:t xml:space="preserve"> </w:t>
@@ -8645,7 +7916,6 @@
         </w:rPr>
         <w:t xml:space="preserve">        [</w:t>
       </w:r>
-      <w:proofErr w:type="spellStart"/>
       <w:r>
         <w:rPr>
           <w:rFonts w:ascii="Cascadia Mono" w:hAnsi="Cascadia Mono" w:cs="Cascadia Mono"/>
@@ -8657,7 +7927,6 @@
         </w:rPr>
         <w:t>ValidateNever</w:t>
       </w:r>
-      <w:proofErr w:type="spellEnd"/>
       <w:r>
         <w:rPr>
           <w:rFonts w:ascii="Cascadia Mono" w:hAnsi="Cascadia Mono" w:cs="Cascadia Mono"/>
@@ -8686,7 +7955,6 @@
         </w:rPr>
         <w:t xml:space="preserve">  </w:t>
       </w:r>
-      <w:proofErr w:type="gramStart"/>
       <w:r>
         <w:rPr>
           <w:rFonts w:ascii="Cascadia Mono" w:hAnsi="Cascadia Mono" w:cs="Cascadia Mono"/>
@@ -8698,7 +7966,6 @@
         </w:rPr>
         <w:t>public</w:t>
       </w:r>
-      <w:proofErr w:type="gramEnd"/>
       <w:r>
         <w:rPr>
           <w:rFonts w:ascii="Cascadia Mono" w:hAnsi="Cascadia Mono" w:cs="Cascadia Mono"/>
@@ -8732,7 +7999,6 @@
         </w:rPr>
         <w:t>&lt;</w:t>
       </w:r>
-      <w:proofErr w:type="spellStart"/>
       <w:r>
         <w:rPr>
           <w:rFonts w:ascii="Cascadia Mono" w:hAnsi="Cascadia Mono" w:cs="Cascadia Mono"/>
@@ -8744,7 +8010,6 @@
         </w:rPr>
         <w:t>AlimentRecette</w:t>
       </w:r>
-      <w:proofErr w:type="spellEnd"/>
       <w:r>
         <w:rPr>
           <w:rFonts w:ascii="Cascadia Mono" w:hAnsi="Cascadia Mono" w:cs="Cascadia Mono"/>
@@ -8754,9 +8019,19 @@
           <w:szCs w:val="19"/>
           <w:highlight w:val="white"/>
         </w:rPr>
-        <w:t xml:space="preserve">&gt; </w:t>
-      </w:r>
-      <w:proofErr w:type="spellStart"/>
+        <w:t xml:space="preserve">&gt; AlimentRecettes { </w:t>
+      </w:r>
+      <w:r>
+        <w:rPr>
+          <w:rFonts w:ascii="Cascadia Mono" w:hAnsi="Cascadia Mono" w:cs="Cascadia Mono"/>
+          <w:color w:val="0000FF"/>
+          <w:kern w:val="0"/>
+          <w:sz w:val="19"/>
+          <w:szCs w:val="19"/>
+          <w:highlight w:val="white"/>
+        </w:rPr>
+        <w:t>get</w:t>
+      </w:r>
       <w:r>
         <w:rPr>
           <w:rFonts w:ascii="Cascadia Mono" w:hAnsi="Cascadia Mono" w:cs="Cascadia Mono"/>
@@ -8766,9 +8041,19 @@
           <w:szCs w:val="19"/>
           <w:highlight w:val="white"/>
         </w:rPr>
-        <w:t>AlimentRecettes</w:t>
-      </w:r>
-      <w:proofErr w:type="spellEnd"/>
+        <w:t xml:space="preserve">; </w:t>
+      </w:r>
+      <w:r>
+        <w:rPr>
+          <w:rFonts w:ascii="Cascadia Mono" w:hAnsi="Cascadia Mono" w:cs="Cascadia Mono"/>
+          <w:color w:val="0000FF"/>
+          <w:kern w:val="0"/>
+          <w:sz w:val="19"/>
+          <w:szCs w:val="19"/>
+          <w:highlight w:val="white"/>
+        </w:rPr>
+        <w:t>set</w:t>
+      </w:r>
       <w:r>
         <w:rPr>
           <w:rFonts w:ascii="Cascadia Mono" w:hAnsi="Cascadia Mono" w:cs="Cascadia Mono"/>
@@ -8778,69 +8063,8 @@
           <w:szCs w:val="19"/>
           <w:highlight w:val="white"/>
         </w:rPr>
-        <w:t xml:space="preserve"> </w:t>
-      </w:r>
-      <w:proofErr w:type="gramStart"/>
-      <w:r>
-        <w:rPr>
-          <w:rFonts w:ascii="Cascadia Mono" w:hAnsi="Cascadia Mono" w:cs="Cascadia Mono"/>
-          <w:color w:val="000000"/>
-          <w:kern w:val="0"/>
-          <w:sz w:val="19"/>
-          <w:szCs w:val="19"/>
-          <w:highlight w:val="white"/>
-        </w:rPr>
-        <w:t xml:space="preserve">{ </w:t>
-      </w:r>
-      <w:proofErr w:type="spellStart"/>
-      <w:r>
-        <w:rPr>
-          <w:rFonts w:ascii="Cascadia Mono" w:hAnsi="Cascadia Mono" w:cs="Cascadia Mono"/>
-          <w:color w:val="0000FF"/>
-          <w:kern w:val="0"/>
-          <w:sz w:val="19"/>
-          <w:szCs w:val="19"/>
-          <w:highlight w:val="white"/>
-        </w:rPr>
-        <w:t>get</w:t>
-      </w:r>
-      <w:proofErr w:type="spellEnd"/>
-      <w:proofErr w:type="gramEnd"/>
-      <w:r>
-        <w:rPr>
-          <w:rFonts w:ascii="Cascadia Mono" w:hAnsi="Cascadia Mono" w:cs="Cascadia Mono"/>
-          <w:color w:val="000000"/>
-          <w:kern w:val="0"/>
-          <w:sz w:val="19"/>
-          <w:szCs w:val="19"/>
-          <w:highlight w:val="white"/>
-        </w:rPr>
-        <w:t xml:space="preserve">; </w:t>
-      </w:r>
-      <w:r>
-        <w:rPr>
-          <w:rFonts w:ascii="Cascadia Mono" w:hAnsi="Cascadia Mono" w:cs="Cascadia Mono"/>
-          <w:color w:val="0000FF"/>
-          <w:kern w:val="0"/>
-          <w:sz w:val="19"/>
-          <w:szCs w:val="19"/>
-          <w:highlight w:val="white"/>
-        </w:rPr>
-        <w:t>set</w:t>
-      </w:r>
-      <w:proofErr w:type="gramStart"/>
-      <w:r>
-        <w:rPr>
-          <w:rFonts w:ascii="Cascadia Mono" w:hAnsi="Cascadia Mono" w:cs="Cascadia Mono"/>
-          <w:color w:val="000000"/>
-          <w:kern w:val="0"/>
-          <w:sz w:val="19"/>
-          <w:szCs w:val="19"/>
-          <w:highlight w:val="white"/>
-        </w:rPr>
         <w:t>; }</w:t>
       </w:r>
-      <w:proofErr w:type="gramEnd"/>
     </w:p>
     <w:p>
       <w:pPr>
@@ -8862,11 +8086,9 @@
       <w:r>
         <w:t xml:space="preserve"> associative </w:t>
       </w:r>
-      <w:proofErr w:type="spellStart"/>
       <w:r>
         <w:t>AlimentRecette</w:t>
       </w:r>
-      <w:proofErr w:type="spellEnd"/>
       <w:r>
         <w:t>.</w:t>
       </w:r>
@@ -9075,17 +8297,8 @@
           <w:b/>
           <w:bCs/>
         </w:rPr>
-        <w:t xml:space="preserve">devez utiliser un </w:t>
-      </w:r>
-      <w:proofErr w:type="spellStart"/>
-      <w:r>
-        <w:rPr>
-          <w:b/>
-          <w:bCs/>
-        </w:rPr>
-        <w:t>ViewModel</w:t>
-      </w:r>
-      <w:proofErr w:type="spellEnd"/>
+        <w:t>devez utiliser un ViewModel</w:t>
+      </w:r>
       <w:r>
         <w:t xml:space="preserve"> qui devra contenir les informations à afficher dans cette vue. </w:t>
       </w:r>
@@ -9094,17 +8307,8 @@
           <w:b/>
           <w:bCs/>
         </w:rPr>
-        <w:t xml:space="preserve">Nommez-le </w:t>
-      </w:r>
-      <w:proofErr w:type="spellStart"/>
-      <w:r>
-        <w:rPr>
-          <w:b/>
-          <w:bCs/>
-        </w:rPr>
-        <w:t>StatVM</w:t>
-      </w:r>
-      <w:proofErr w:type="spellEnd"/>
+        <w:t>Nommez-le StatVM</w:t>
+      </w:r>
       <w:r>
         <w:t>.</w:t>
       </w:r>
@@ -9130,7 +8334,6 @@
       <w:r>
         <w:t xml:space="preserve"> utiliser </w:t>
       </w:r>
-      <w:proofErr w:type="spellStart"/>
       <w:r>
         <w:rPr>
           <w:b/>
@@ -9138,7 +8341,6 @@
         </w:rPr>
         <w:t>Linq</w:t>
       </w:r>
-      <w:proofErr w:type="spellEnd"/>
       <w:r>
         <w:t xml:space="preserve"> pour obtenir les </w:t>
       </w:r>
@@ -9158,15 +8360,7 @@
         <w:t xml:space="preserve">nécessitera </w:t>
       </w:r>
       <w:r>
-        <w:t xml:space="preserve">l'utilisation d'au moins une méthode </w:t>
-      </w:r>
-      <w:proofErr w:type="spellStart"/>
-      <w:r>
-        <w:t>Linq</w:t>
-      </w:r>
-      <w:proofErr w:type="spellEnd"/>
-      <w:r>
-        <w:t>.</w:t>
+        <w:t>l'utilisation d'au moins une méthode Linq.</w:t>
       </w:r>
       <w:r>
         <w:t xml:space="preserve"> </w:t>
@@ -9190,17 +8384,8 @@
           <w:b/>
           <w:bCs/>
         </w:rPr>
-        <w:t xml:space="preserve">utiliser les méthodes </w:t>
-      </w:r>
-      <w:proofErr w:type="spellStart"/>
-      <w:r>
-        <w:rPr>
-          <w:b/>
-          <w:bCs/>
-        </w:rPr>
-        <w:t>Linq</w:t>
-      </w:r>
-      <w:proofErr w:type="spellEnd"/>
+        <w:t>utiliser les méthodes Linq</w:t>
+      </w:r>
       <w:r>
         <w:rPr>
           <w:b/>
@@ -9434,7 +8619,6 @@
       <w:r>
         <w:t xml:space="preserve"> et </w:t>
       </w:r>
-      <w:proofErr w:type="spellStart"/>
       <w:r>
         <w:rPr>
           <w:b/>
@@ -9442,7 +8626,6 @@
         </w:rPr>
         <w:t>Sum</w:t>
       </w:r>
-      <w:proofErr w:type="spellEnd"/>
       <w:r>
         <w:t>.</w:t>
       </w:r>
@@ -9466,13 +8649,8 @@
         <w:t xml:space="preserve"> CaloriesPour100g</w:t>
       </w:r>
       <w:r>
-        <w:t xml:space="preserve"> de la classe Aliment et Poids de la classe associative </w:t>
-      </w:r>
-      <w:proofErr w:type="spellStart"/>
-      <w:r>
-        <w:t>AlimentRecettes</w:t>
-      </w:r>
-      <w:proofErr w:type="spellEnd"/>
+        <w:t xml:space="preserve"> de la classe Aliment et Poids de la classe associative AlimentRecettes</w:t>
+      </w:r>
       <w:r>
         <w:t xml:space="preserve"> pour faire votre calcul</w:t>
       </w:r>
@@ -9531,6 +8709,7 @@
         <w:rPr>
           <w:b/>
           <w:bCs/>
+          <w:noProof/>
         </w:rPr>
         <w:drawing>
           <wp:inline distT="0" distB="0" distL="0" distR="0" wp14:anchorId="4672F59A" wp14:editId="771EC36B">
@@ -10753,7 +9932,6 @@
       <w:r>
         <w:t xml:space="preserve">également utiliser un </w:t>
       </w:r>
-      <w:proofErr w:type="spellStart"/>
       <w:r>
         <w:rPr>
           <w:b/>
@@ -10761,14 +9939,12 @@
         </w:rPr>
         <w:t>ViewModel</w:t>
       </w:r>
-      <w:proofErr w:type="spellEnd"/>
       <w:r>
         <w:t xml:space="preserve"> qui doit se nommer</w:t>
       </w:r>
       <w:r>
         <w:t xml:space="preserve"> </w:t>
       </w:r>
-      <w:proofErr w:type="spellStart"/>
       <w:r>
         <w:rPr>
           <w:b/>
@@ -10776,7 +9952,6 @@
         </w:rPr>
         <w:t>RecetteCategorieVM</w:t>
       </w:r>
-      <w:proofErr w:type="spellEnd"/>
       <w:r>
         <w:rPr>
           <w:b/>
@@ -10804,7 +9979,6 @@
       <w:r>
         <w:t xml:space="preserve">également utiliser un </w:t>
       </w:r>
-      <w:proofErr w:type="spellStart"/>
       <w:r>
         <w:rPr>
           <w:b/>
@@ -10812,14 +9986,12 @@
         </w:rPr>
         <w:t>ViewModel</w:t>
       </w:r>
-      <w:proofErr w:type="spellEnd"/>
       <w:r>
         <w:t xml:space="preserve"> qui doit se nommer</w:t>
       </w:r>
       <w:r>
         <w:t xml:space="preserve"> </w:t>
       </w:r>
-      <w:proofErr w:type="spellStart"/>
       <w:r>
         <w:rPr>
           <w:b/>
@@ -10827,7 +9999,6 @@
         </w:rPr>
         <w:t>RecetteInfoVM</w:t>
       </w:r>
-      <w:proofErr w:type="spellEnd"/>
       <w:r>
         <w:rPr>
           <w:b/>
@@ -10882,28 +10053,18 @@
         </w:numPr>
       </w:pPr>
       <w:r>
-        <w:t xml:space="preserve">Le </w:t>
-      </w:r>
-      <w:proofErr w:type="spellStart"/>
-      <w:r>
-        <w:t>ViewModel</w:t>
-      </w:r>
-      <w:proofErr w:type="spellEnd"/>
+        <w:t>Le ViewModel </w:t>
+      </w:r>
+      <w:r>
+        <w:rPr>
+          <w:b/>
+          <w:bCs/>
+        </w:rPr>
+        <w:t>RecetteCategorieVM</w:t>
+      </w:r>
       <w:r>
         <w:t> </w:t>
       </w:r>
-      <w:proofErr w:type="spellStart"/>
-      <w:r>
-        <w:rPr>
-          <w:b/>
-          <w:bCs/>
-        </w:rPr>
-        <w:t>RecetteCategorieVM</w:t>
-      </w:r>
-      <w:proofErr w:type="spellEnd"/>
-      <w:r>
-        <w:t> </w:t>
-      </w:r>
       <w:r>
         <w:rPr>
           <w:b/>
@@ -10921,7 +10082,6 @@
         </w:rPr>
         <w:t>List&lt;</w:t>
       </w:r>
-      <w:proofErr w:type="spellStart"/>
       <w:r>
         <w:rPr>
           <w:b/>
@@ -10934,15 +10094,7 @@
           <w:b/>
           <w:bCs/>
         </w:rPr>
-        <w:t>VM</w:t>
-      </w:r>
-      <w:proofErr w:type="spellEnd"/>
-      <w:r>
-        <w:rPr>
-          <w:b/>
-          <w:bCs/>
-        </w:rPr>
-        <w:t>&gt;</w:t>
+        <w:t>VM&gt;</w:t>
       </w:r>
     </w:p>
     <w:p>
@@ -10993,7 +10145,6 @@
       <w:r>
         <w:t xml:space="preserve"> (</w:t>
       </w:r>
-      <w:proofErr w:type="spellStart"/>
       <w:r>
         <w:rPr>
           <w:b/>
@@ -11001,7 +10152,6 @@
         </w:rPr>
         <w:t>AllRecettes.cshtml</w:t>
       </w:r>
-      <w:proofErr w:type="spellEnd"/>
       <w:r>
         <w:t>)</w:t>
       </w:r>
@@ -11037,7 +10187,6 @@
       <w:r>
         <w:t xml:space="preserve"> (</w:t>
       </w:r>
-      <w:proofErr w:type="spellStart"/>
       <w:r>
         <w:rPr>
           <w:b/>
@@ -11045,7 +10194,6 @@
         </w:rPr>
         <w:t>RecetteCategorie.cshtml</w:t>
       </w:r>
-      <w:proofErr w:type="spellEnd"/>
       <w:r>
         <w:t>)</w:t>
       </w:r>
@@ -11081,7 +10229,6 @@
       <w:r>
         <w:t xml:space="preserve"> (</w:t>
       </w:r>
-      <w:proofErr w:type="spellStart"/>
       <w:r>
         <w:rPr>
           <w:b/>
@@ -11089,7 +10236,6 @@
         </w:rPr>
         <w:t>RecetteInfo.cshtml</w:t>
       </w:r>
-      <w:proofErr w:type="spellEnd"/>
       <w:r>
         <w:t>)</w:t>
       </w:r>
@@ -11188,6 +10334,9 @@
       <w:pPr>
         <w:pStyle w:val="Paragraphedeliste"/>
       </w:pPr>
+      <w:r>
+        <w:t>D</w:t>
+      </w:r>
     </w:p>
     <w:p>
       <w:pPr>
@@ -11307,31 +10456,7 @@
         </w:rPr>
       </w:pPr>
       <w:r>
-        <w:t>Utilisez une couleur différente pour chaque message. Vous pouvez utiliser les classes (</w:t>
-      </w:r>
-      <w:proofErr w:type="spellStart"/>
-      <w:r>
-        <w:t>text-success</w:t>
-      </w:r>
-      <w:proofErr w:type="spellEnd"/>
-      <w:r>
-        <w:t xml:space="preserve">, </w:t>
-      </w:r>
-      <w:proofErr w:type="spellStart"/>
-      <w:r>
-        <w:t>text</w:t>
-      </w:r>
-      <w:proofErr w:type="spellEnd"/>
-      <w:r>
-        <w:t xml:space="preserve">-warning, </w:t>
-      </w:r>
-      <w:proofErr w:type="spellStart"/>
-      <w:r>
-        <w:t>text</w:t>
-      </w:r>
-      <w:proofErr w:type="spellEnd"/>
-      <w:r>
-        <w:t>-danger)</w:t>
+        <w:t>Utilisez une couleur différente pour chaque message. Vous pouvez utiliser les classes (text-success, text-warning, text-danger)</w:t>
       </w:r>
       <w:r>
         <w:t xml:space="preserve">. </w:t>
@@ -12118,23 +11243,8 @@
                 <w:lang w:eastAsia="fr-CA"/>
                 <w14:ligatures w14:val="none"/>
               </w:rPr>
-              <w:t xml:space="preserve">Vues partielles et </w:t>
+              <w:t>Vues partielles et FontAwesome</w:t>
             </w:r>
-            <w:proofErr w:type="spellStart"/>
-            <w:r>
-              <w:rPr>
-                <w:rFonts w:ascii="Aptos" w:eastAsia="Times New Roman" w:hAnsi="Aptos" w:cs="Times New Roman"/>
-                <w:b/>
-                <w:bCs/>
-                <w:kern w:val="0"/>
-                <w:sz w:val="20"/>
-                <w:szCs w:val="20"/>
-                <w:lang w:eastAsia="fr-CA"/>
-                <w14:ligatures w14:val="none"/>
-              </w:rPr>
-              <w:t>FontAwesome</w:t>
-            </w:r>
-            <w:proofErr w:type="spellEnd"/>
           </w:p>
         </w:tc>
         <w:tc>
@@ -12352,35 +11462,7 @@
                 <w:lang w:eastAsia="fr-CA"/>
                 <w14:ligatures w14:val="none"/>
               </w:rPr>
-              <w:t>Consignes Git (</w:t>
-            </w:r>
-            <w:proofErr w:type="spellStart"/>
-            <w:r>
-              <w:rPr>
-                <w:rFonts w:ascii="Aptos" w:eastAsia="Times New Roman" w:hAnsi="Aptos" w:cs="Times New Roman"/>
-                <w:b/>
-                <w:bCs/>
-                <w:kern w:val="0"/>
-                <w:sz w:val="20"/>
-                <w:szCs w:val="20"/>
-                <w:lang w:eastAsia="fr-CA"/>
-                <w14:ligatures w14:val="none"/>
-              </w:rPr>
-              <w:t>commits</w:t>
-            </w:r>
-            <w:proofErr w:type="spellEnd"/>
-            <w:r>
-              <w:rPr>
-                <w:rFonts w:ascii="Aptos" w:eastAsia="Times New Roman" w:hAnsi="Aptos" w:cs="Times New Roman"/>
-                <w:b/>
-                <w:bCs/>
-                <w:kern w:val="0"/>
-                <w:sz w:val="20"/>
-                <w:szCs w:val="20"/>
-                <w:lang w:eastAsia="fr-CA"/>
-                <w14:ligatures w14:val="none"/>
-              </w:rPr>
-              <w:t>/push)</w:t>
+              <w:t>Consignes Git (commits/push)</w:t>
             </w:r>
           </w:p>
         </w:tc>

</xml_diff>